<commit_message>
RFI comment: drop From line, note CNAScoreCard tracks but does not weight the field
Co-Authored-By: Claude Fable 5.1 <noreply@anthropic.com>
Claude-Session: https://claude.ai/code/session_01SZkVFi8ZpiCXLQfQmfrnse
</commit_message>
<xml_diff>
--- a/precondition_extraction/evaluation/rfi/NIST-2026-0100-comment-short.docx
+++ b/precondition_extraction/evaluation/rfi/NIST-2026-0100-comment-short.docx
@@ -55,29 +55,10 @@
           <w:b/>
           <w:bCs/>
         </w:rPr>
-        <w:t xml:space="preserve">From:</w:t>
-      </w:r>
-      <w:r>
-        <w:t xml:space="preserve"> </w:t>
-      </w:r>
-      <w:r>
-        <w:rPr>
-          <w:rFonts w:ascii="Consolas" w:cs="Consolas" w:eastAsia="Consolas" w:hAnsi="Consolas"/>
-        </w:rPr>
-        <w:t xml:space="preserve">[NAME]</w:t>
-      </w:r>
-      <w:r>
-        <w:t xml:space="preserve">, independent vulnerability-management practitioner, Ireland. </w:t>
-      </w:r>
-      <w:r>
-        <w:rPr>
-          <w:b/>
-          <w:bCs/>
-        </w:rPr>
         <w:t xml:space="preserve">Interest to declare:</w:t>
       </w:r>
       <w:r>
-        <w:t xml:space="preserve"> none. Independent and non-commercial; no product, nothing for sale. The figures below are from my own measurement, described in each section.</w:t>
+        <w:t xml:space="preserve"> none. I am an independent vulnerability-management practitioner in Ireland; non-commercial, no product, nothing for sale. The figures below are from my own measurement, described in each section.</w:t>
       </w:r>
     </w:p>
     <w:p>
@@ -900,7 +881,7 @@
         <w:t xml:space="preserve">Publish coverage as a rate, by year of publication, and keep the series.</w:t>
       </w:r>
       <w:r>
-        <w:t xml:space="preserve"> A repeated public measurement gives CNAs something to be measured against.</w:t>
+        <w:t xml:space="preserve"> The community-run CNAScoreCard already tracks this field, but assigns it no weight in a CNA's score, and reports it as the share of CNAs that have ever used it rather than the share of records that carry it. A repeated public measurement, as a record-level rate, gives CNAs something to be measured against.</w:t>
       </w:r>
     </w:p>
     <w:p>
@@ -960,7 +941,7 @@
       <w:r>
         <w:t xml:space="preserve">CVE record format schema: </w:t>
       </w:r>
-      <w:hyperlink w:history="1" r:id="rIdflu8-5ovjikshbnd8aii5">
+      <w:hyperlink w:history="1" r:id="rIdeoj2c647k5_4rryo1srks">
         <w:r>
           <w:rPr>
             <w:rStyle w:val="Hyperlink"/>
@@ -991,7 +972,7 @@
       <w:r>
         <w:t xml:space="preserve">, 18 Aug 2026: </w:t>
       </w:r>
-      <w:hyperlink w:history="1" r:id="rIdc39au-ax3imnsl_jwudgw">
+      <w:hyperlink w:history="1" r:id="rIdqfcc_mdoctlkm5m_mb8nm">
         <w:r>
           <w:rPr>
             <w:rStyle w:val="Hyperlink"/>
@@ -1012,7 +993,7 @@
       <w:r>
         <w:t xml:space="preserve">CNA Operational Rules v4.1.0: </w:t>
       </w:r>
-      <w:hyperlink w:history="1" r:id="rIdqvlf1l93jufnrvqgcrgly">
+      <w:hyperlink w:history="1" r:id="rIdr5rsrm4ymuouylnanpyni">
         <w:r>
           <w:rPr>
             <w:rStyle w:val="Hyperlink"/>
@@ -1031,9 +1012,30 @@
         <w:spacing w:after="120"/>
       </w:pPr>
       <w:r>
+        <w:t xml:space="preserve">CNAScoreCard field-utilisation data: </w:t>
+      </w:r>
+      <w:hyperlink w:history="1" r:id="rIdq04srbvbtraz5nrlwubla">
+        <w:r>
+          <w:rPr>
+            <w:rStyle w:val="Hyperlink"/>
+          </w:rPr>
+          <w:t xml:space="preserve">https://github.com/RogoLabs/CNAScoreCard</w:t>
+        </w:r>
+      </w:hyperlink>
+    </w:p>
+    <w:p>
+      <w:pPr>
+        <w:pStyle w:val="ListParagraph"/>
+        <w:numPr>
+          <w:ilvl w:val="0"/>
+          <w:numId w:val="1"/>
+        </w:numPr>
+        <w:spacing w:after="120"/>
+      </w:pPr>
+      <w:r>
         <w:t xml:space="preserve">CPE applicability quick-start guide: </w:t>
       </w:r>
-      <w:hyperlink w:history="1" r:id="rIdqhwkrtc2mp6edizmekk-z">
+      <w:hyperlink w:history="1" r:id="rIdm0dfs2bxvckbbrkrtpdn0">
         <w:r>
           <w:rPr>
             <w:rStyle w:val="Hyperlink"/>

</xml_diff>

<commit_message>
RFI comment: name questions answered, drop interest line, offer data on request
Co-Authored-By: Claude Fable 5.1 <noreply@anthropic.com>
Claude-Session: https://claude.ai/code/session_01SZkVFi8ZpiCXLQfQmfrnse
</commit_message>
<xml_diff>
--- a/precondition_extraction/evaluation/rfi/NIST-2026-0100-comment-short.docx
+++ b/precondition_extraction/evaluation/rfi/NIST-2026-0100-comment-short.docx
@@ -51,14 +51,7 @@
         <w:spacing w:after="160"/>
       </w:pPr>
       <w:r>
-        <w:rPr>
-          <w:b/>
-          <w:bCs/>
-        </w:rPr>
-        <w:t xml:space="preserve">Interest to declare:</w:t>
-      </w:r>
-      <w:r>
-        <w:t xml:space="preserve"> none. I am an independent vulnerability-management practitioner in Ireland; non-commercial, no product, nothing for sale. The figures below are from my own measurement, described in each section.</w:t>
+        <w:t xml:space="preserve">This comment responds to questions 5a, 5c and 5e (Vulnerability Data and Standards). The figures below are from my own measurement, described in each section; the underlying data and method are available on request.</w:t>
       </w:r>
     </w:p>
     <w:p>
@@ -941,7 +934,7 @@
       <w:r>
         <w:t xml:space="preserve">CVE record format schema: </w:t>
       </w:r>
-      <w:hyperlink w:history="1" r:id="rIdeoj2c647k5_4rryo1srks">
+      <w:hyperlink w:history="1" r:id="rId9jrv3sbroizico854jjbd">
         <w:r>
           <w:rPr>
             <w:rStyle w:val="Hyperlink"/>
@@ -972,7 +965,7 @@
       <w:r>
         <w:t xml:space="preserve">, 18 Aug 2026: </w:t>
       </w:r>
-      <w:hyperlink w:history="1" r:id="rIdqfcc_mdoctlkm5m_mb8nm">
+      <w:hyperlink w:history="1" r:id="rIdahaiv5klqycvylrbz_qq6">
         <w:r>
           <w:rPr>
             <w:rStyle w:val="Hyperlink"/>
@@ -993,7 +986,7 @@
       <w:r>
         <w:t xml:space="preserve">CNA Operational Rules v4.1.0: </w:t>
       </w:r>
-      <w:hyperlink w:history="1" r:id="rIdr5rsrm4ymuouylnanpyni">
+      <w:hyperlink w:history="1" r:id="rIdxdr9lbjhs-0mg1qrln9yh">
         <w:r>
           <w:rPr>
             <w:rStyle w:val="Hyperlink"/>
@@ -1014,7 +1007,7 @@
       <w:r>
         <w:t xml:space="preserve">CNAScoreCard field-utilisation data: </w:t>
       </w:r>
-      <w:hyperlink w:history="1" r:id="rIdq04srbvbtraz5nrlwubla">
+      <w:hyperlink w:history="1" r:id="rIdqueujjnedmiody5q-yf3i">
         <w:r>
           <w:rPr>
             <w:rStyle w:val="Hyperlink"/>
@@ -1035,7 +1028,7 @@
       <w:r>
         <w:t xml:space="preserve">CPE applicability quick-start guide: </w:t>
       </w:r>
-      <w:hyperlink w:history="1" r:id="rIdm0dfs2bxvckbbrkrtpdn0">
+      <w:hyperlink w:history="1" r:id="rIdkjztdyltxognl4whoxqdw">
         <w:r>
           <w:rPr>
             <w:rStyle w:val="Hyperlink"/>

</xml_diff>